<commit_message>
Convert SWPs 206, 208 and 217 to the Heritage Safe Work Procedure format; widen JSEA column in all SWPs
Co-Authored-By: Claude Opus 5.5 <noreply@anthropic.com>
Claude-Session: https://claude.ai/code/session_01UHnSDEBA56GANs2gfXuK2P
</commit_message>
<xml_diff>
--- a/SWP/MM-4034-033-OR-03-SWP-212-Laboratory-Sample-Preparation-RevA.docx
+++ b/SWP/MM-4034-033-OR-03-SWP-212-Laboratory-Sample-Preparation-RevA.docx
@@ -4492,9 +4492,9 @@
         <w:tblLook w:val="04A0" w:firstRow="1" w:lastRow="0" w:firstColumn="1" w:lastColumn="0" w:noHBand="0" w:noVBand="1"/>
       </w:tblPr>
       <w:tblGrid>
-        <w:gridCol w:w="2200"/>
-        <w:gridCol w:w="2200"/>
-        <w:gridCol w:w="4094"/>
+        <w:gridCol w:w="2450"/>
+        <w:gridCol w:w="2300"/>
+        <w:gridCol w:w="3744"/>
         <w:gridCol w:w="1700"/>
       </w:tblGrid>
       <w:tr>
@@ -4504,7 +4504,7 @@
         </w:trPr>
         <w:tc>
           <w:tcPr>
-            <w:tcW w:w="2200" w:type="dxa"/>
+            <w:tcW w:w="2450" w:type="dxa"/>
             <w:shd w:val="clear" w:color="auto" w:fill="BFBFBF" w:themeFill="background1" w:themeFillShade="BF"/>
             <w:vAlign w:val="center"/>
           </w:tcPr>
@@ -4529,7 +4529,7 @@
         </w:tc>
         <w:tc>
           <w:tcPr>
-            <w:tcW w:w="2200" w:type="dxa"/>
+            <w:tcW w:w="2300" w:type="dxa"/>
             <w:shd w:val="clear" w:color="auto" w:fill="BFBFBF" w:themeFill="background1" w:themeFillShade="BF"/>
             <w:vAlign w:val="center"/>
           </w:tcPr>
@@ -4554,7 +4554,7 @@
         </w:tc>
         <w:tc>
           <w:tcPr>
-            <w:tcW w:w="4094" w:type="dxa"/>
+            <w:tcW w:w="3744" w:type="dxa"/>
             <w:shd w:val="clear" w:color="auto" w:fill="BFBFBF" w:themeFill="background1" w:themeFillShade="BF"/>
             <w:vAlign w:val="center"/>
           </w:tcPr>
@@ -4610,7 +4610,7 @@
         </w:trPr>
         <w:tc>
           <w:tcPr>
-            <w:tcW w:w="2200" w:type="dxa"/>
+            <w:tcW w:w="2450" w:type="dxa"/>
             <w:vAlign w:val="center"/>
           </w:tcPr>
           <w:p>
@@ -4630,7 +4630,7 @@
         </w:tc>
         <w:tc>
           <w:tcPr>
-            <w:tcW w:w="2200" w:type="dxa"/>
+            <w:tcW w:w="2300" w:type="dxa"/>
             <w:vAlign w:val="center"/>
           </w:tcPr>
           <w:p>
@@ -4650,7 +4650,7 @@
         </w:tc>
         <w:tc>
           <w:tcPr>
-            <w:tcW w:w="4094" w:type="dxa"/>
+            <w:tcW w:w="3744" w:type="dxa"/>
             <w:vAlign w:val="center"/>
           </w:tcPr>
           <w:p>
@@ -4696,7 +4696,7 @@
         </w:trPr>
         <w:tc>
           <w:tcPr>
-            <w:tcW w:w="2200" w:type="dxa"/>
+            <w:tcW w:w="2450" w:type="dxa"/>
             <w:vAlign w:val="center"/>
           </w:tcPr>
           <w:p>
@@ -4716,7 +4716,7 @@
         </w:tc>
         <w:tc>
           <w:tcPr>
-            <w:tcW w:w="2200" w:type="dxa"/>
+            <w:tcW w:w="2300" w:type="dxa"/>
             <w:vAlign w:val="center"/>
           </w:tcPr>
           <w:p>
@@ -4736,7 +4736,7 @@
         </w:tc>
         <w:tc>
           <w:tcPr>
-            <w:tcW w:w="4094" w:type="dxa"/>
+            <w:tcW w:w="3744" w:type="dxa"/>
             <w:vAlign w:val="center"/>
           </w:tcPr>
           <w:p>
@@ -4782,7 +4782,7 @@
         </w:trPr>
         <w:tc>
           <w:tcPr>
-            <w:tcW w:w="2200" w:type="dxa"/>
+            <w:tcW w:w="2450" w:type="dxa"/>
             <w:vAlign w:val="center"/>
           </w:tcPr>
           <w:p>
@@ -4802,7 +4802,7 @@
         </w:tc>
         <w:tc>
           <w:tcPr>
-            <w:tcW w:w="2200" w:type="dxa"/>
+            <w:tcW w:w="2300" w:type="dxa"/>
             <w:vAlign w:val="center"/>
           </w:tcPr>
           <w:p>
@@ -4822,7 +4822,7 @@
         </w:tc>
         <w:tc>
           <w:tcPr>
-            <w:tcW w:w="4094" w:type="dxa"/>
+            <w:tcW w:w="3744" w:type="dxa"/>
             <w:vAlign w:val="center"/>
           </w:tcPr>
           <w:p>
@@ -4868,7 +4868,7 @@
         </w:trPr>
         <w:tc>
           <w:tcPr>
-            <w:tcW w:w="2200" w:type="dxa"/>
+            <w:tcW w:w="2450" w:type="dxa"/>
             <w:vAlign w:val="center"/>
           </w:tcPr>
           <w:p>
@@ -4888,7 +4888,7 @@
         </w:tc>
         <w:tc>
           <w:tcPr>
-            <w:tcW w:w="2200" w:type="dxa"/>
+            <w:tcW w:w="2300" w:type="dxa"/>
             <w:vAlign w:val="center"/>
           </w:tcPr>
           <w:p>
@@ -4908,7 +4908,7 @@
         </w:tc>
         <w:tc>
           <w:tcPr>
-            <w:tcW w:w="4094" w:type="dxa"/>
+            <w:tcW w:w="3744" w:type="dxa"/>
             <w:vAlign w:val="center"/>
           </w:tcPr>
           <w:p>
@@ -4954,7 +4954,7 @@
         </w:trPr>
         <w:tc>
           <w:tcPr>
-            <w:tcW w:w="2200" w:type="dxa"/>
+            <w:tcW w:w="2450" w:type="dxa"/>
             <w:vAlign w:val="center"/>
           </w:tcPr>
           <w:p>
@@ -4974,7 +4974,7 @@
         </w:tc>
         <w:tc>
           <w:tcPr>
-            <w:tcW w:w="2200" w:type="dxa"/>
+            <w:tcW w:w="2300" w:type="dxa"/>
             <w:vAlign w:val="center"/>
           </w:tcPr>
           <w:p>
@@ -4994,7 +4994,7 @@
         </w:tc>
         <w:tc>
           <w:tcPr>
-            <w:tcW w:w="4094" w:type="dxa"/>
+            <w:tcW w:w="3744" w:type="dxa"/>
             <w:vAlign w:val="center"/>
           </w:tcPr>
           <w:p>
@@ -5040,7 +5040,7 @@
         </w:trPr>
         <w:tc>
           <w:tcPr>
-            <w:tcW w:w="2200" w:type="dxa"/>
+            <w:tcW w:w="2450" w:type="dxa"/>
             <w:vAlign w:val="center"/>
           </w:tcPr>
           <w:p>
@@ -5060,7 +5060,7 @@
         </w:tc>
         <w:tc>
           <w:tcPr>
-            <w:tcW w:w="2200" w:type="dxa"/>
+            <w:tcW w:w="2300" w:type="dxa"/>
             <w:vAlign w:val="center"/>
           </w:tcPr>
           <w:p>
@@ -5080,7 +5080,7 @@
         </w:tc>
         <w:tc>
           <w:tcPr>
-            <w:tcW w:w="4094" w:type="dxa"/>
+            <w:tcW w:w="3744" w:type="dxa"/>
             <w:vAlign w:val="center"/>
           </w:tcPr>
           <w:p>
@@ -5126,7 +5126,7 @@
         </w:trPr>
         <w:tc>
           <w:tcPr>
-            <w:tcW w:w="2200" w:type="dxa"/>
+            <w:tcW w:w="2450" w:type="dxa"/>
             <w:vAlign w:val="center"/>
           </w:tcPr>
           <w:p>
@@ -5146,7 +5146,7 @@
         </w:tc>
         <w:tc>
           <w:tcPr>
-            <w:tcW w:w="2200" w:type="dxa"/>
+            <w:tcW w:w="2300" w:type="dxa"/>
             <w:vAlign w:val="center"/>
           </w:tcPr>
           <w:p>
@@ -5166,7 +5166,7 @@
         </w:tc>
         <w:tc>
           <w:tcPr>
-            <w:tcW w:w="4094" w:type="dxa"/>
+            <w:tcW w:w="3744" w:type="dxa"/>
             <w:vAlign w:val="center"/>
           </w:tcPr>
           <w:p>
@@ -5212,7 +5212,7 @@
         </w:trPr>
         <w:tc>
           <w:tcPr>
-            <w:tcW w:w="2200" w:type="dxa"/>
+            <w:tcW w:w="2450" w:type="dxa"/>
             <w:vAlign w:val="center"/>
           </w:tcPr>
           <w:p>
@@ -5232,7 +5232,7 @@
         </w:tc>
         <w:tc>
           <w:tcPr>
-            <w:tcW w:w="2200" w:type="dxa"/>
+            <w:tcW w:w="2300" w:type="dxa"/>
             <w:vAlign w:val="center"/>
           </w:tcPr>
           <w:p>
@@ -5252,7 +5252,7 @@
         </w:tc>
         <w:tc>
           <w:tcPr>
-            <w:tcW w:w="4094" w:type="dxa"/>
+            <w:tcW w:w="3744" w:type="dxa"/>
             <w:vAlign w:val="center"/>
           </w:tcPr>
           <w:p>
@@ -5298,7 +5298,7 @@
         </w:trPr>
         <w:tc>
           <w:tcPr>
-            <w:tcW w:w="2200" w:type="dxa"/>
+            <w:tcW w:w="2450" w:type="dxa"/>
             <w:vAlign w:val="center"/>
           </w:tcPr>
           <w:p>
@@ -5318,7 +5318,7 @@
         </w:tc>
         <w:tc>
           <w:tcPr>
-            <w:tcW w:w="2200" w:type="dxa"/>
+            <w:tcW w:w="2300" w:type="dxa"/>
             <w:vAlign w:val="center"/>
           </w:tcPr>
           <w:p>
@@ -5338,7 +5338,7 @@
         </w:tc>
         <w:tc>
           <w:tcPr>
-            <w:tcW w:w="4094" w:type="dxa"/>
+            <w:tcW w:w="3744" w:type="dxa"/>
             <w:vAlign w:val="center"/>
           </w:tcPr>
           <w:p>
@@ -5384,7 +5384,7 @@
         </w:trPr>
         <w:tc>
           <w:tcPr>
-            <w:tcW w:w="2200" w:type="dxa"/>
+            <w:tcW w:w="2450" w:type="dxa"/>
             <w:vAlign w:val="center"/>
           </w:tcPr>
           <w:p>
@@ -5404,7 +5404,7 @@
         </w:tc>
         <w:tc>
           <w:tcPr>
-            <w:tcW w:w="2200" w:type="dxa"/>
+            <w:tcW w:w="2300" w:type="dxa"/>
             <w:vAlign w:val="center"/>
           </w:tcPr>
           <w:p>
@@ -5424,7 +5424,7 @@
         </w:tc>
         <w:tc>
           <w:tcPr>
-            <w:tcW w:w="4094" w:type="dxa"/>
+            <w:tcW w:w="3744" w:type="dxa"/>
             <w:vAlign w:val="center"/>
           </w:tcPr>
           <w:p>
@@ -5470,7 +5470,7 @@
         </w:trPr>
         <w:tc>
           <w:tcPr>
-            <w:tcW w:w="2200" w:type="dxa"/>
+            <w:tcW w:w="2450" w:type="dxa"/>
             <w:vAlign w:val="center"/>
           </w:tcPr>
           <w:p>
@@ -5490,7 +5490,7 @@
         </w:tc>
         <w:tc>
           <w:tcPr>
-            <w:tcW w:w="2200" w:type="dxa"/>
+            <w:tcW w:w="2300" w:type="dxa"/>
             <w:vAlign w:val="center"/>
           </w:tcPr>
           <w:p>
@@ -5510,7 +5510,7 @@
         </w:tc>
         <w:tc>
           <w:tcPr>
-            <w:tcW w:w="4094" w:type="dxa"/>
+            <w:tcW w:w="3744" w:type="dxa"/>
             <w:vAlign w:val="center"/>
           </w:tcPr>
           <w:p>
@@ -5556,7 +5556,7 @@
         </w:trPr>
         <w:tc>
           <w:tcPr>
-            <w:tcW w:w="2200" w:type="dxa"/>
+            <w:tcW w:w="2450" w:type="dxa"/>
             <w:vAlign w:val="center"/>
           </w:tcPr>
           <w:p>
@@ -5576,7 +5576,7 @@
         </w:tc>
         <w:tc>
           <w:tcPr>
-            <w:tcW w:w="2200" w:type="dxa"/>
+            <w:tcW w:w="2300" w:type="dxa"/>
             <w:vAlign w:val="center"/>
           </w:tcPr>
           <w:p>
@@ -5596,7 +5596,7 @@
         </w:tc>
         <w:tc>
           <w:tcPr>
-            <w:tcW w:w="4094" w:type="dxa"/>
+            <w:tcW w:w="3744" w:type="dxa"/>
             <w:vAlign w:val="center"/>
           </w:tcPr>
           <w:p>
@@ -5642,7 +5642,7 @@
         </w:trPr>
         <w:tc>
           <w:tcPr>
-            <w:tcW w:w="2200" w:type="dxa"/>
+            <w:tcW w:w="2450" w:type="dxa"/>
             <w:vAlign w:val="center"/>
           </w:tcPr>
           <w:p>
@@ -5662,7 +5662,7 @@
         </w:tc>
         <w:tc>
           <w:tcPr>
-            <w:tcW w:w="2200" w:type="dxa"/>
+            <w:tcW w:w="2300" w:type="dxa"/>
             <w:vAlign w:val="center"/>
           </w:tcPr>
           <w:p>
@@ -5682,7 +5682,7 @@
         </w:tc>
         <w:tc>
           <w:tcPr>
-            <w:tcW w:w="4094" w:type="dxa"/>
+            <w:tcW w:w="3744" w:type="dxa"/>
             <w:vAlign w:val="center"/>
           </w:tcPr>
           <w:p>
@@ -5728,7 +5728,7 @@
         </w:trPr>
         <w:tc>
           <w:tcPr>
-            <w:tcW w:w="2200" w:type="dxa"/>
+            <w:tcW w:w="2450" w:type="dxa"/>
             <w:vAlign w:val="center"/>
           </w:tcPr>
           <w:p>
@@ -5748,7 +5748,7 @@
         </w:tc>
         <w:tc>
           <w:tcPr>
-            <w:tcW w:w="2200" w:type="dxa"/>
+            <w:tcW w:w="2300" w:type="dxa"/>
             <w:vAlign w:val="center"/>
           </w:tcPr>
           <w:p>
@@ -5768,7 +5768,7 @@
         </w:tc>
         <w:tc>
           <w:tcPr>
-            <w:tcW w:w="4094" w:type="dxa"/>
+            <w:tcW w:w="3744" w:type="dxa"/>
             <w:vAlign w:val="center"/>
           </w:tcPr>
           <w:p>
@@ -5814,7 +5814,7 @@
         </w:trPr>
         <w:tc>
           <w:tcPr>
-            <w:tcW w:w="2200" w:type="dxa"/>
+            <w:tcW w:w="2450" w:type="dxa"/>
             <w:vAlign w:val="center"/>
           </w:tcPr>
           <w:p>
@@ -5834,7 +5834,7 @@
         </w:tc>
         <w:tc>
           <w:tcPr>
-            <w:tcW w:w="2200" w:type="dxa"/>
+            <w:tcW w:w="2300" w:type="dxa"/>
             <w:vAlign w:val="center"/>
           </w:tcPr>
           <w:p>
@@ -5854,7 +5854,7 @@
         </w:tc>
         <w:tc>
           <w:tcPr>
-            <w:tcW w:w="4094" w:type="dxa"/>
+            <w:tcW w:w="3744" w:type="dxa"/>
             <w:vAlign w:val="center"/>
           </w:tcPr>
           <w:p>
@@ -5900,7 +5900,7 @@
         </w:trPr>
         <w:tc>
           <w:tcPr>
-            <w:tcW w:w="2200" w:type="dxa"/>
+            <w:tcW w:w="2450" w:type="dxa"/>
             <w:vAlign w:val="center"/>
           </w:tcPr>
           <w:p>
@@ -5920,7 +5920,7 @@
         </w:tc>
         <w:tc>
           <w:tcPr>
-            <w:tcW w:w="2200" w:type="dxa"/>
+            <w:tcW w:w="2300" w:type="dxa"/>
             <w:vAlign w:val="center"/>
           </w:tcPr>
           <w:p>
@@ -5940,7 +5940,7 @@
         </w:tc>
         <w:tc>
           <w:tcPr>
-            <w:tcW w:w="4094" w:type="dxa"/>
+            <w:tcW w:w="3744" w:type="dxa"/>
             <w:vAlign w:val="center"/>
           </w:tcPr>
           <w:p>
@@ -5986,7 +5986,7 @@
         </w:trPr>
         <w:tc>
           <w:tcPr>
-            <w:tcW w:w="2200" w:type="dxa"/>
+            <w:tcW w:w="2450" w:type="dxa"/>
             <w:vAlign w:val="center"/>
           </w:tcPr>
           <w:p>
@@ -6006,7 +6006,7 @@
         </w:tc>
         <w:tc>
           <w:tcPr>
-            <w:tcW w:w="2200" w:type="dxa"/>
+            <w:tcW w:w="2300" w:type="dxa"/>
             <w:vAlign w:val="center"/>
           </w:tcPr>
           <w:p>
@@ -6026,7 +6026,7 @@
         </w:tc>
         <w:tc>
           <w:tcPr>
-            <w:tcW w:w="4094" w:type="dxa"/>
+            <w:tcW w:w="3744" w:type="dxa"/>
             <w:vAlign w:val="center"/>
           </w:tcPr>
           <w:p>

</xml_diff>